<commit_message>
docs: add 'why terms of trade decline' Q&A explainer to script primer
</commit_message>
<xml_diff>
--- a/docs/UNCTAD-Presentation-Script.docx
+++ b/docs/UNCTAD-Presentation-Script.docx
@@ -144,6 +144,197 @@
           <w:szCs w:val="22"/>
         </w:rPr>
         <w:t xml:space="preserve">That’s called declining terms of trade, and the specific idea is the Prebisch-Singer thesis. If you understand this one paragraph, you understand the entire report.</w:t>
+      </w:r>
+    </w:p>
+    <w:p>
+      <w:pPr>
+        <w:spacing w:after="80" w:before="240"/>
+      </w:pPr>
+      <w:r>
+        <w:rPr>
+          <w:rFonts w:ascii="Calibri" w:cs="Calibri" w:eastAsia="Calibri" w:hAnsi="Calibri"/>
+          <w:b/>
+          <w:bCs/>
+          <w:sz w:val="24"/>
+          <w:szCs w:val="24"/>
+        </w:rPr>
+        <w:t xml:space="preserve">Why does it actually decline? (the part a smart classmate might ask)</w:t>
+      </w:r>
+    </w:p>
+    <w:p>
+      <w:pPr>
+        <w:spacing w:after="140" w:line="300"/>
+      </w:pPr>
+      <w:r>
+        <w:rPr>
+          <w:rFonts w:ascii="Calibri" w:cs="Calibri" w:eastAsia="Calibri" w:hAnsi="Calibri"/>
+          <w:sz w:val="22"/>
+          <w:szCs w:val="22"/>
+        </w:rPr>
+        <w:t xml:space="preserve">Five reasons stack on top of each other. You don’t need all five to present, but if someone asks “but why does the price fall?”, here they are:</w:t>
+      </w:r>
+    </w:p>
+    <w:p>
+      <w:pPr>
+        <w:pStyle w:val="ListParagraph"/>
+        <w:numPr>
+          <w:ilvl w:val="0"/>
+          <w:numId w:val="1"/>
+        </w:numPr>
+        <w:spacing w:after="80"/>
+      </w:pPr>
+      <w:r>
+        <w:rPr>
+          <w:rFonts w:ascii="Calibri" w:cs="Calibri" w:eastAsia="Calibri" w:hAnsi="Calibri"/>
+          <w:b/>
+          <w:bCs/>
+          <w:sz w:val="22"/>
+          <w:szCs w:val="22"/>
+        </w:rPr>
+        <w:t xml:space="preserve">People don’t buy more raw stuff as they get richer: </w:t>
+      </w:r>
+      <w:r>
+        <w:rPr>
+          <w:rFonts w:ascii="Calibri" w:cs="Calibri" w:eastAsia="Calibri" w:hAnsi="Calibri"/>
+          <w:sz w:val="22"/>
+          <w:szCs w:val="22"/>
+        </w:rPr>
+        <w:t xml:space="preserve">double your income and you don’t drink double the coffee, but you do buy far more cars, phones, and medicine. So as the world grows, demand for manufactured goods races ahead of demand for commodities, and price follows demand. (Economists call this Engel’s Law.)</w:t>
+      </w:r>
+    </w:p>
+    <w:p>
+      <w:pPr>
+        <w:pStyle w:val="ListParagraph"/>
+        <w:numPr>
+          <w:ilvl w:val="0"/>
+          <w:numId w:val="1"/>
+        </w:numPr>
+        <w:spacing w:after="80"/>
+      </w:pPr>
+      <w:r>
+        <w:rPr>
+          <w:rFonts w:ascii="Calibri" w:cs="Calibri" w:eastAsia="Calibri" w:hAnsi="Calibri"/>
+          <w:b/>
+          <w:bCs/>
+          <w:sz w:val="22"/>
+          <w:szCs w:val="22"/>
+        </w:rPr>
+        <w:t xml:space="preserve">The gains from efficiency go to different people: </w:t>
+      </w:r>
+      <w:r>
+        <w:rPr>
+          <w:rFonts w:ascii="Calibri" w:cs="Calibri" w:eastAsia="Calibri" w:hAnsi="Calibri"/>
+          <w:sz w:val="22"/>
+          <w:szCs w:val="22"/>
+        </w:rPr>
+        <w:t xml:space="preserve">when a rich-country factory gets cheaper to run, big firms and strong unions keep the savings as profit and wages, so the price stays up. When a poor-country farm gets more efficient, thousands of competing farmers undercut each other and the savings get passed to the buyer as a lower price. Same progress, opposite result. This is Prebisch’s main point.</w:t>
+      </w:r>
+    </w:p>
+    <w:p>
+      <w:pPr>
+        <w:pStyle w:val="ListParagraph"/>
+        <w:numPr>
+          <w:ilvl w:val="0"/>
+          <w:numId w:val="1"/>
+        </w:numPr>
+        <w:spacing w:after="80"/>
+      </w:pPr>
+      <w:r>
+        <w:rPr>
+          <w:rFonts w:ascii="Calibri" w:cs="Calibri" w:eastAsia="Calibri" w:hAnsi="Calibri"/>
+          <w:b/>
+          <w:bCs/>
+          <w:sz w:val="22"/>
+          <w:szCs w:val="22"/>
+        </w:rPr>
+        <w:t xml:space="preserve">Commodities are interchangeable; manufactures aren’t: </w:t>
+      </w:r>
+      <w:r>
+        <w:rPr>
+          <w:rFonts w:ascii="Calibri" w:cs="Calibri" w:eastAsia="Calibri" w:hAnsi="Calibri"/>
+          <w:sz w:val="22"/>
+          <w:szCs w:val="22"/>
+        </w:rPr>
+        <w:t xml:space="preserve">a ton of copper is a ton of copper, so you take whatever price the market hands you. A branded, patented product lets the seller set the price. Price-takers lose to price-makers over time.</w:t>
+      </w:r>
+    </w:p>
+    <w:p>
+      <w:pPr>
+        <w:pStyle w:val="ListParagraph"/>
+        <w:numPr>
+          <w:ilvl w:val="0"/>
+          <w:numId w:val="1"/>
+        </w:numPr>
+        <w:spacing w:after="80"/>
+      </w:pPr>
+      <w:r>
+        <w:rPr>
+          <w:rFonts w:ascii="Calibri" w:cs="Calibri" w:eastAsia="Calibri" w:hAnsi="Calibri"/>
+          <w:b/>
+          <w:bCs/>
+          <w:sz w:val="22"/>
+          <w:szCs w:val="22"/>
+        </w:rPr>
+        <w:t xml:space="preserve">Technology keeps shrinking how much raw material the world needs: </w:t>
+      </w:r>
+      <w:r>
+        <w:rPr>
+          <w:rFonts w:ascii="Calibri" w:cs="Calibri" w:eastAsia="Calibri" w:hAnsi="Calibri"/>
+          <w:sz w:val="22"/>
+          <w:szCs w:val="22"/>
+        </w:rPr>
+        <w:t xml:space="preserve">more efficient machines use less metal, and synthetics replace natural materials (plastics, synthetic rubber, fiber optics instead of copper). Commodity demand has a lid on it that manufactured goods don’t.</w:t>
+      </w:r>
+    </w:p>
+    <w:p>
+      <w:pPr>
+        <w:pStyle w:val="ListParagraph"/>
+        <w:numPr>
+          <w:ilvl w:val="0"/>
+          <w:numId w:val="1"/>
+        </w:numPr>
+        <w:spacing w:after="80"/>
+      </w:pPr>
+      <w:r>
+        <w:rPr>
+          <w:rFonts w:ascii="Calibri" w:cs="Calibri" w:eastAsia="Calibri" w:hAnsi="Calibri"/>
+          <w:b/>
+          <w:bCs/>
+          <w:sz w:val="22"/>
+          <w:szCs w:val="22"/>
+        </w:rPr>
+        <w:t xml:space="preserve">The oversupply trap: </w:t>
+      </w:r>
+      <w:r>
+        <w:rPr>
+          <w:rFonts w:ascii="Calibri" w:cs="Calibri" w:eastAsia="Calibri" w:hAnsi="Calibri"/>
+          <w:sz w:val="22"/>
+          <w:szCs w:val="22"/>
+        </w:rPr>
+        <w:t xml:space="preserve">many poor countries depend on the same crop. When the price dips, each one exports more to cover the lost income, which floods the market and pushes the price down further. Rational for one country, self-defeating for all. This is exactly the “you flood your own market” mechanic in the game.</w:t>
+      </w:r>
+    </w:p>
+    <w:p>
+      <w:pPr>
+        <w:spacing w:after="140"/>
+      </w:pPr>
+      <w:r>
+        <w:rPr>
+          <w:rFonts w:ascii="Calibri" w:cs="Calibri" w:eastAsia="Calibri" w:hAnsi="Calibri"/>
+          <w:b/>
+          <w:bCs/>
+          <w:sz w:val="22"/>
+          <w:szCs w:val="22"/>
+        </w:rPr>
+        <w:t xml:space="preserve">Be honest if someone pushes. </w:t>
+      </w:r>
+      <w:r>
+        <w:rPr>
+          <w:rFonts w:ascii="Calibri" w:cs="Calibri" w:eastAsia="Calibri" w:hAnsi="Calibri"/>
+          <w:sz w:val="22"/>
+          <w:szCs w:val="22"/>
+        </w:rPr>
+        <w:t xml:space="preserve">Prebisch-Singer is a long-run tendency, not an iron law. Over the last century the data mostly drifts downward, but it’s noisy, and there are real boom periods, like the 2000s commodity supercycle when China’s demand sent copper and oil soaring. If a classmate says “but prices spiked in the 2000s,” the answer is: yes, in bursts, but the long-run structural pull is still downward, and when the boom ends the floor drops back out. That’s exactly why UNCTAD’s answer isn’t “wait for a good price,” it’s “stop depending on the price at all,” which means diversify.</w:t>
       </w:r>
     </w:p>
     <w:p>

</xml_diff>